<commit_message>
refactor(mainwindow): Extract services and implement MVVM with DI container
- Extract business logic into dedicated services (FileOperationsService, SearchService, MermaidUpdateService, ExportService) with interfaces
- Create MainWindowViewModel to manage UI state and commands via ICommand pattern
- Introduce Microsoft.Extensions.DependencyInjection in App.xaml.cs for centralized service registration
- Split MainWindow.xaml.cs into focused partial class files (WebView, FileOps, Export, RenderMode, ScrollSync, Search, UI, Builder)
- Add comprehensive unit tests for new services and ViewModels with property-based testing
- Update project structure documentation and refactoring specifications
- Maintain all existing functionality while improving code organization and testability
</commit_message>
<xml_diff>
--- a/TestWordExport.docx
+++ b/TestWordExport.docx
@@ -48,7 +48,7 @@
           <wp:inline xmlns:wp="http://schemas.openxmlformats.org/drawingml/2006/wordprocessingDrawing" distT="0" distB="0" distL="0" distR="0">
             <wp:extent cx="1838325" cy="4067175"/>
             <wp:effectExtent l="0" t="0" r="0" b="0"/>
-            <wp:docPr id="2" name="Image2"/>
+            <wp:docPr id="1" name="Image1"/>
             <wp:cNvGraphicFramePr>
               <a:graphicFrameLocks xmlns:a="http://schemas.openxmlformats.org/drawingml/2006/main" noChangeAspect="1"/>
             </wp:cNvGraphicFramePr>
@@ -56,11 +56,11 @@
               <a:graphicData uri="http://schemas.openxmlformats.org/drawingml/2006/picture">
                 <pic:pic xmlns:pic="http://schemas.openxmlformats.org/drawingml/2006/picture">
                   <pic:nvPicPr>
-                    <pic:cNvPr id="0" name="Image2"/>
+                    <pic:cNvPr id="0" name="Image1"/>
                     <pic:cNvPicPr/>
                   </pic:nvPicPr>
                   <pic:blipFill>
-                    <a:blip xmlns:r="http://schemas.openxmlformats.org/officeDocument/2006/relationships" r:embed="R16963c1fe5de4665"/>
+                    <a:blip xmlns:r="http://schemas.openxmlformats.org/officeDocument/2006/relationships" r:embed="R63e8a276a7304999"/>
                     <a:stretch>
                       <a:fillRect/>
                     </a:stretch>

</xml_diff>